<commit_message>
Elevate GitHub account from optional to required for groups
Group projects need a shared git remote — the "scripts are source of
truth, sync via git" workflow doesn't work without one, and groups
submit from a shared repo. Every member needs an account to push or be
added as a collaborator (the public sample clone still needs none).

- PREREQS Part C3 rewritten: required, with steps (sign up, create repo +
  add collaborators, set up auth via Claude).
- Added to the bring-to-class checklist.
- Added to the "What You Bring" slide.
- Regenerated docx/pptx.

Co-Authored-By: Claude Opus 4.7 (1M context) <noreply@anthropic.com>
</commit_message>
<xml_diff>
--- a/PREREQS.docx
+++ b/PREREQS.docx
@@ -1661,13 +1661,13 @@
       </w:r>
     </w:p>
     <w:bookmarkEnd w:id="19"/>
-    <w:bookmarkStart w:id="21" w:name="Xf16e58ea3a122e168545cfd73319a25280c9096"/>
+    <w:bookmarkStart w:id="21" w:name="X32a43ed29b8a873f41b8a56a2ced939cba71825"/>
     <w:p>
       <w:pPr>
         <w:pStyle w:val="Heading2"/>
       </w:pPr>
       <w:r>
-        <w:t xml:space="preserve">C3. GitHub account (optional but recommended)</w:t>
+        <w:t xml:space="preserve">C3. GitHub account (required for your group)</w:t>
       </w:r>
     </w:p>
     <w:p>
@@ -1675,13 +1675,7 @@
         <w:pStyle w:val="FirstParagraph"/>
       </w:pPr>
       <w:r>
-        <w:t xml:space="preserve">Your group will probably push your project to GitHub.</w:t>
-      </w:r>
-      <w:r>
-        <w:t xml:space="preserve"> </w:t>
-      </w:r>
-      <w:r>
-        <w:t xml:space="preserve">- The course sample repo is</w:t>
+        <w:t xml:space="preserve">You work in groups, and your group needs a shared place to version the project — the schema scripts, the C# code, the docs. GitHub is the default. So</w:t>
       </w:r>
       <w:r>
         <w:t xml:space="preserve"> </w:t>
@@ -1691,19 +1685,116 @@
           <w:b/>
           <w:bCs/>
         </w:rPr>
-        <w:t xml:space="preserve">public</w:t>
-      </w:r>
-      <w:r>
-        <w:t xml:space="preserve"> </w:t>
-      </w:r>
-      <w:r>
-        <w:t xml:space="preserve">— clone needs no account.</w:t>
-      </w:r>
-      <w:r>
-        <w:t xml:space="preserve"> </w:t>
-      </w:r>
-      <w:r>
-        <w:t xml:space="preserve">- For your own repo: sign up at</w:t>
+        <w:t xml:space="preserve">every group member needs a GitHub account.</w:t>
+      </w:r>
+    </w:p>
+    <w:p>
+      <w:pPr>
+        <w:pStyle w:val="Compact"/>
+        <w:numPr>
+          <w:ilvl w:val="0"/>
+          <w:numId w:val="1006"/>
+        </w:numPr>
+      </w:pPr>
+      <w:r>
+        <w:t xml:space="preserve">Cloning the course sample repo needs</w:t>
+      </w:r>
+      <w:r>
+        <w:t xml:space="preserve"> </w:t>
+      </w:r>
+      <w:r>
+        <w:rPr>
+          <w:b/>
+          <w:bCs/>
+        </w:rPr>
+        <w:t xml:space="preserve">no</w:t>
+      </w:r>
+      <w:r>
+        <w:t xml:space="preserve"> </w:t>
+      </w:r>
+      <w:r>
+        <w:t xml:space="preserve">account (it’s public).</w:t>
+      </w:r>
+    </w:p>
+    <w:p>
+      <w:pPr>
+        <w:pStyle w:val="Compact"/>
+        <w:numPr>
+          <w:ilvl w:val="0"/>
+          <w:numId w:val="1006"/>
+        </w:numPr>
+      </w:pPr>
+      <w:r>
+        <w:t xml:space="preserve">But pushing to your group’s own repo, or being added as a collaborator on it,</w:t>
+      </w:r>
+      <w:r>
+        <w:t xml:space="preserve"> </w:t>
+      </w:r>
+      <w:r>
+        <w:rPr>
+          <w:b/>
+          <w:bCs/>
+        </w:rPr>
+        <w:t xml:space="preserve">does</w:t>
+      </w:r>
+      <w:r>
+        <w:t xml:space="preserve"> </w:t>
+      </w:r>
+      <w:r>
+        <w:t xml:space="preserve">need an account.</w:t>
+      </w:r>
+    </w:p>
+    <w:p>
+      <w:pPr>
+        <w:pStyle w:val="Compact"/>
+        <w:numPr>
+          <w:ilvl w:val="0"/>
+          <w:numId w:val="1006"/>
+        </w:numPr>
+      </w:pPr>
+      <w:r>
+        <w:t xml:space="preserve">The</w:t>
+      </w:r>
+      <w:r>
+        <w:t xml:space="preserve"> </w:t>
+      </w:r>
+      <w:r>
+        <w:t xml:space="preserve">“source of truth lives in git”</w:t>
+      </w:r>
+      <w:r>
+        <w:t xml:space="preserve"> </w:t>
+      </w:r>
+      <w:r>
+        <w:t xml:space="preserve">workflow (schema changes go into</w:t>
+      </w:r>
+      <w:r>
+        <w:t xml:space="preserve"> </w:t>
+      </w:r>
+      <w:r>
+        <w:rPr>
+          <w:rStyle w:val="VerbatimChar"/>
+        </w:rPr>
+        <w:t xml:space="preserve">.sql</w:t>
+      </w:r>
+      <w:r>
+        <w:t xml:space="preserve"> </w:t>
+      </w:r>
+      <w:r>
+        <w:t xml:space="preserve">files, commit, teammates pull and re-run) only works once you have a shared remote.</w:t>
+      </w:r>
+    </w:p>
+    <w:p>
+      <w:pPr>
+        <w:pStyle w:val="FirstParagraph"/>
+      </w:pPr>
+      <w:r>
+        <w:t xml:space="preserve">Steps:</w:t>
+      </w:r>
+      <w:r>
+        <w:t xml:space="preserve"> </w:t>
+      </w:r>
+      <w:r>
+        <w:t xml:space="preserve">1. Each member signs up at</w:t>
       </w:r>
       <w:r>
         <w:t xml:space="preserve"> </w:t>
@@ -1717,7 +1808,46 @@
         </w:r>
       </w:hyperlink>
       <w:r>
-        <w:t xml:space="preserve">, then ask Claude to help set up authentication (GitHub CLI is easiest).</w:t>
+        <w:t xml:space="preserve"> </w:t>
+      </w:r>
+      <w:r>
+        <w:t xml:space="preserve">(free).</w:t>
+      </w:r>
+      <w:r>
+        <w:t xml:space="preserve"> </w:t>
+      </w:r>
+      <w:r>
+        <w:t xml:space="preserve">2. One member creates the group repo and adds the others as collaborators (Settings → Collaborators).</w:t>
+      </w:r>
+      <w:r>
+        <w:t xml:space="preserve"> </w:t>
+      </w:r>
+      <w:r>
+        <w:t xml:space="preserve">3. Each member sets up authentication for pushing. Ask Claude:</w:t>
+      </w:r>
+      <w:r>
+        <w:t xml:space="preserve"> </w:t>
+      </w:r>
+      <w:r>
+        <w:rPr>
+          <w:i/>
+          <w:iCs/>
+        </w:rPr>
+        <w:t xml:space="preserve">“Help me set up GitHub authentication so I can push — I’m on Windows.”</w:t>
+      </w:r>
+      <w:r>
+        <w:t xml:space="preserve"> </w:t>
+      </w:r>
+      <w:r>
+        <w:t xml:space="preserve">(GitHub CLI is the easiest path; Claude can install and configure it.)</w:t>
+      </w:r>
+    </w:p>
+    <w:p>
+      <w:pPr>
+        <w:pStyle w:val="BodyText"/>
+      </w:pPr>
+      <w:r>
+        <w:t xml:space="preserve">If your group has decided to host elsewhere (GitLab, BGU’s internal Git), that’s fine — the lesson doesn’t depend on GitHub specifically, but you still each need an account on whatever host you chose.</w:t>
       </w:r>
     </w:p>
     <w:p>
@@ -1903,18 +2033,6 @@
       </w:pPr>
       <w:r>
         <w:t xml:space="preserve">The day of class:</w:t>
-      </w:r>
-    </w:p>
-    <w:p>
-      <w:pPr>
-        <w:pStyle w:val="Compact"/>
-        <w:numPr>
-          <w:ilvl w:val="0"/>
-          <w:numId w:val="1006"/>
-        </w:numPr>
-      </w:pPr>
-      <w:r>
-        <w:t xml:space="preserve">Claude Code is signed in (test message returns a reply)</w:t>
       </w:r>
     </w:p>
     <w:p>
@@ -1926,7 +2044,7 @@
         </w:numPr>
       </w:pPr>
       <w:r>
-        <w:t xml:space="preserve">VS 2025 opens</w:t>
+        <w:t xml:space="preserve">Claude Code is signed in (test message returns a reply)</w:t>
       </w:r>
     </w:p>
     <w:p>
@@ -1938,7 +2056,7 @@
         </w:numPr>
       </w:pPr>
       <w:r>
-        <w:t xml:space="preserve">SSMS connects to your local instance with Windows Authentication</w:t>
+        <w:t xml:space="preserve">VS 2025 opens</w:t>
       </w:r>
     </w:p>
     <w:p>
@@ -1950,52 +2068,7 @@
         </w:numPr>
       </w:pPr>
       <w:r>
-        <w:rPr>
-          <w:rStyle w:val="VerbatimChar"/>
-        </w:rPr>
-        <w:t xml:space="preserve">dotnet --version</w:t>
-      </w:r>
-      <w:r>
-        <w:t xml:space="preserve">,</w:t>
-      </w:r>
-      <w:r>
-        <w:t xml:space="preserve"> </w:t>
-      </w:r>
-      <w:r>
-        <w:rPr>
-          <w:rStyle w:val="VerbatimChar"/>
-        </w:rPr>
-        <w:t xml:space="preserve">git --version</w:t>
-      </w:r>
-      <w:r>
-        <w:t xml:space="preserve">,</w:t>
-      </w:r>
-      <w:r>
-        <w:t xml:space="preserve"> </w:t>
-      </w:r>
-      <w:r>
-        <w:rPr>
-          <w:rStyle w:val="VerbatimChar"/>
-        </w:rPr>
-        <w:t xml:space="preserve">uvx --version</w:t>
-      </w:r>
-      <w:r>
-        <w:t xml:space="preserve">,</w:t>
-      </w:r>
-      <w:r>
-        <w:t xml:space="preserve"> </w:t>
-      </w:r>
-      <w:r>
-        <w:rPr>
-          <w:rStyle w:val="VerbatimChar"/>
-        </w:rPr>
-        <w:t xml:space="preserve">sqlcmd -L</w:t>
-      </w:r>
-      <w:r>
-        <w:t xml:space="preserve"> </w:t>
-      </w:r>
-      <w:r>
-        <w:t xml:space="preserve">all work in a fresh terminal</w:t>
+        <w:t xml:space="preserve">SSMS connects to your local instance with Windows Authentication</w:t>
       </w:r>
     </w:p>
     <w:p>
@@ -2004,6 +2077,75 @@
         <w:numPr>
           <w:ilvl w:val="0"/>
           <w:numId w:val="1010"/>
+        </w:numPr>
+      </w:pPr>
+      <w:r>
+        <w:rPr>
+          <w:rStyle w:val="VerbatimChar"/>
+        </w:rPr>
+        <w:t xml:space="preserve">dotnet --version</w:t>
+      </w:r>
+      <w:r>
+        <w:t xml:space="preserve">,</w:t>
+      </w:r>
+      <w:r>
+        <w:t xml:space="preserve"> </w:t>
+      </w:r>
+      <w:r>
+        <w:rPr>
+          <w:rStyle w:val="VerbatimChar"/>
+        </w:rPr>
+        <w:t xml:space="preserve">git --version</w:t>
+      </w:r>
+      <w:r>
+        <w:t xml:space="preserve">,</w:t>
+      </w:r>
+      <w:r>
+        <w:t xml:space="preserve"> </w:t>
+      </w:r>
+      <w:r>
+        <w:rPr>
+          <w:rStyle w:val="VerbatimChar"/>
+        </w:rPr>
+        <w:t xml:space="preserve">uvx --version</w:t>
+      </w:r>
+      <w:r>
+        <w:t xml:space="preserve">,</w:t>
+      </w:r>
+      <w:r>
+        <w:t xml:space="preserve"> </w:t>
+      </w:r>
+      <w:r>
+        <w:rPr>
+          <w:rStyle w:val="VerbatimChar"/>
+        </w:rPr>
+        <w:t xml:space="preserve">sqlcmd -L</w:t>
+      </w:r>
+      <w:r>
+        <w:t xml:space="preserve"> </w:t>
+      </w:r>
+      <w:r>
+        <w:t xml:space="preserve">all work in a fresh terminal</w:t>
+      </w:r>
+    </w:p>
+    <w:p>
+      <w:pPr>
+        <w:pStyle w:val="Compact"/>
+        <w:numPr>
+          <w:ilvl w:val="0"/>
+          <w:numId w:val="1011"/>
+        </w:numPr>
+      </w:pPr>
+      <w:r>
+        <w:t xml:space="preserve">You have a GitHub account and can push (or your group’s chosen Git host)</w:t>
+      </w:r>
+    </w:p>
+    <w:p>
+      <w:pPr>
+        <w:pStyle w:val="Compact"/>
+        <w:numPr>
+          <w:ilvl w:val="0"/>
+          <w:numId w:val="1012"/>
         </w:numPr>
       </w:pPr>
       <w:r>
@@ -3667,7 +3809,7 @@
     <w:abstractNumId w:val="991"/>
   </w:num>
   <w:num w:numId="1006">
-    <w:abstractNumId w:val="992"/>
+    <w:abstractNumId w:val="991"/>
   </w:num>
   <w:num w:numId="1007">
     <w:abstractNumId w:val="992"/>
@@ -3679,6 +3821,12 @@
     <w:abstractNumId w:val="992"/>
   </w:num>
   <w:num w:numId="1010">
+    <w:abstractNumId w:val="992"/>
+  </w:num>
+  <w:num w:numId="1011">
+    <w:abstractNumId w:val="992"/>
+  </w:num>
+  <w:num w:numId="1012">
     <w:abstractNumId w:val="992"/>
   </w:num>
 </w:numbering>

</xml_diff>

<commit_message>
Add title page (BGU logo + course + lecturer) and per-chapter page breaks to PREREQS.docx
- Extracted the BGU logo from the Group 30 PDF header (bgu-logo.png).
- Added a title-page block to PREREQS.md using custom-style divs: centered
  logo, course name (Software Analysis and Design), subtitle, and lecturer
  (David Codish).
- Built reference.docx with two changes vs pandoc default: Heading 1 has
  pageBreakBefore (every main chapter starts on a new page), and a new
  "Centered" paragraph style for the logo.
- Regenerated PREREQS.docx with --reference-doc=reference.docx.

Regeneration command (note: differs from the other docs — uses the
reference doc, drops --toc to keep the title page first):
  pandoc PREREQS.md -o PREREQS.docx --reference-doc=reference.docx --standalone

Lecturer name and course name are plain text in PREREQS.md's title block —
edit and regenerate if they need changing.

Co-Authored-By: Claude Opus 4.7 (1M context) <noreply@anthropic.com>
</commit_message>
<xml_diff>
--- a/PREREQS.docx
+++ b/PREREQS.docx
@@ -2,33 +2,78 @@
 <file path=word/document.xml><?xml version="1.0" encoding="utf-8"?>
 <w:document xmlns:w="http://schemas.openxmlformats.org/wordprocessingml/2006/main" xmlns:m="http://schemas.openxmlformats.org/officeDocument/2006/math" xmlns:r="http://schemas.openxmlformats.org/officeDocument/2006/relationships" xmlns:o="urn:schemas-microsoft-com:office:office" xmlns:v="urn:schemas-microsoft-com:vml" xmlns:w10="urn:schemas-microsoft-com:office:word" xmlns:a="http://schemas.openxmlformats.org/drawingml/2006/main" xmlns:pic="http://schemas.openxmlformats.org/drawingml/2006/picture" xmlns:wp="http://schemas.openxmlformats.org/drawingml/2006/wordprocessingDrawing">
   <w:body>
-    <w:sdt>
-      <w:sdtPr>
-        <w:docPartObj>
-          <w:docPartGallery w:val="Table of Contents"/>
-          <w:docPartUnique/>
-        </w:docPartObj>
-      </w:sdtPr>
-      <w:sdtContent>
-        <w:p>
-          <w:pPr>
-            <w:pStyle w:val="TOCHeading"/>
-          </w:pPr>
-          <w:r>
-            <w:t xml:space="preserve">Table of Contents</w:t>
-          </w:r>
-        </w:p>
-        <w:p>
-          <w:r>
-            <w:fldChar w:fldCharType="begin" w:dirty="true"/>
-            <w:instrText xml:space="preserve">TOC \o "1-3" \h \z \u</w:instrText>
-            <w:fldChar w:fldCharType="separate"/>
-            <w:fldChar w:fldCharType="end"/>
-          </w:r>
-        </w:p>
-      </w:sdtContent>
-    </w:sdt>
-    <w:bookmarkStart w:id="10" w:name="prerequisites-sad-course-pre-class-setup"/>
+    <w:p>
+      <w:pPr>
+        <w:pStyle w:val="Centered"/>
+      </w:pPr>
+      <w:r>
+        <w:drawing>
+          <wp:inline>
+            <wp:extent cx="2926080" cy="883743"/>
+            <wp:effectExtent b="0" l="0" r="0" t="0"/>
+            <wp:docPr descr="" title="" id="10" name="Picture"/>
+            <a:graphic>
+              <a:graphicData uri="http://schemas.openxmlformats.org/drawingml/2006/picture">
+                <pic:pic>
+                  <pic:nvPicPr>
+                    <pic:cNvPr descr="bgu-logo.png" id="11" name="Picture"/>
+                    <pic:cNvPicPr>
+                      <a:picLocks noChangeArrowheads="1" noChangeAspect="1"/>
+                    </pic:cNvPicPr>
+                  </pic:nvPicPr>
+                  <pic:blipFill>
+                    <a:blip r:embed="rId9"/>
+                    <a:stretch>
+                      <a:fillRect/>
+                    </a:stretch>
+                  </pic:blipFill>
+                  <pic:spPr bwMode="auto">
+                    <a:xfrm>
+                      <a:off x="0" y="0"/>
+                      <a:ext cx="2926080" cy="883743"/>
+                    </a:xfrm>
+                    <a:prstGeom prst="rect">
+                      <a:avLst/>
+                    </a:prstGeom>
+                    <a:noFill/>
+                    <a:ln w="9525">
+                      <a:noFill/>
+                      <a:headEnd/>
+                      <a:tailEnd/>
+                    </a:ln>
+                  </pic:spPr>
+                </pic:pic>
+              </a:graphicData>
+            </a:graphic>
+          </wp:inline>
+        </w:drawing>
+      </w:r>
+    </w:p>
+    <w:p>
+      <w:pPr>
+        <w:pStyle w:val="Title"/>
+      </w:pPr>
+      <w:r>
+        <w:t xml:space="preserve">Software Analysis and Design</w:t>
+      </w:r>
+    </w:p>
+    <w:p>
+      <w:pPr>
+        <w:pStyle w:val="Subtitle"/>
+      </w:pPr>
+      <w:r>
+        <w:t xml:space="preserve">Pre-Class Setup Guide</w:t>
+      </w:r>
+    </w:p>
+    <w:p>
+      <w:pPr>
+        <w:pStyle w:val="Author"/>
+      </w:pPr>
+      <w:r>
+        <w:t xml:space="preserve">Lecturer: David Codish</w:t>
+      </w:r>
+    </w:p>
+    <w:bookmarkStart w:id="13" w:name="prerequisites-sad-course-pre-class-setup"/>
     <w:p>
       <w:pPr>
         <w:pStyle w:val="Heading1"/>
@@ -79,7 +124,7 @@
         <w:t xml:space="preserve">~45 minutes if nothing fails. Plan for an hour to be safe. Reboot before you start.</w:t>
       </w:r>
     </w:p>
-    <w:bookmarkStart w:id="9" w:name="X0cc8275105db44d38dccef78eee08effa819431"/>
+    <w:bookmarkStart w:id="12" w:name="X0cc8275105db44d38dccef78eee08effa819431"/>
     <w:p>
       <w:pPr>
         <w:pStyle w:val="Heading2"/>
@@ -233,9 +278,9 @@
         </w:pict>
       </w:r>
     </w:p>
-    <w:bookmarkEnd w:id="9"/>
-    <w:bookmarkEnd w:id="10"/>
-    <w:bookmarkStart w:id="16" w:name="part-a-bootstrap-do-these-by-hand"/>
+    <w:bookmarkEnd w:id="12"/>
+    <w:bookmarkEnd w:id="13"/>
+    <w:bookmarkStart w:id="19" w:name="part-a-bootstrap-do-these-by-hand"/>
     <w:p>
       <w:pPr>
         <w:pStyle w:val="Heading1"/>
@@ -244,7 +289,7 @@
         <w:t xml:space="preserve">Part A — Bootstrap (Do These by Hand)</w:t>
       </w:r>
     </w:p>
-    <w:bookmarkStart w:id="12" w:name="a1.-vscode"/>
+    <w:bookmarkStart w:id="15" w:name="a1.-vscode"/>
     <w:p>
       <w:pPr>
         <w:pStyle w:val="Heading2"/>
@@ -263,7 +308,7 @@
       <w:r>
         <w:t xml:space="preserve"> </w:t>
       </w:r>
-      <w:hyperlink r:id="rId11">
+      <w:hyperlink r:id="rId14">
         <w:r>
           <w:rPr>
             <w:rStyle w:val="Hyperlink"/>
@@ -363,8 +408,8 @@
         <w:t xml:space="preserve">Open VSCode once to confirm it launches.</w:t>
       </w:r>
     </w:p>
-    <w:bookmarkEnd w:id="12"/>
-    <w:bookmarkStart w:id="14" w:name="a2.-claude-pro-or-max-subscription"/>
+    <w:bookmarkEnd w:id="15"/>
+    <w:bookmarkStart w:id="17" w:name="a2.-claude-pro-or-max-subscription"/>
     <w:p>
       <w:pPr>
         <w:pStyle w:val="Heading2"/>
@@ -411,7 +456,7 @@
       <w:r>
         <w:t xml:space="preserve"> </w:t>
       </w:r>
-      <w:hyperlink r:id="rId13">
+      <w:hyperlink r:id="rId16">
         <w:r>
           <w:rPr>
             <w:rStyle w:val="Hyperlink"/>
@@ -507,8 +552,8 @@
         <w:t xml:space="preserve">Complete checkout.</w:t>
       </w:r>
     </w:p>
-    <w:bookmarkEnd w:id="14"/>
-    <w:bookmarkStart w:id="15" w:name="a3.-claude-code-extension-sign-in"/>
+    <w:bookmarkEnd w:id="17"/>
+    <w:bookmarkStart w:id="18" w:name="a3.-claude-code-extension-sign-in"/>
     <w:p>
       <w:pPr>
         <w:pStyle w:val="Heading2"/>
@@ -676,9 +721,9 @@
         </w:pict>
       </w:r>
     </w:p>
-    <w:bookmarkEnd w:id="15"/>
-    <w:bookmarkEnd w:id="16"/>
-    <w:bookmarkStart w:id="17" w:name="part-b-let-claude-install-the-rest"/>
+    <w:bookmarkEnd w:id="18"/>
+    <w:bookmarkEnd w:id="19"/>
+    <w:bookmarkStart w:id="20" w:name="part-b-let-claude-install-the-rest"/>
     <w:p>
       <w:pPr>
         <w:pStyle w:val="Heading1"/>
@@ -1056,8 +1101,8 @@
         </w:pict>
       </w:r>
     </w:p>
-    <w:bookmarkEnd w:id="17"/>
-    <w:bookmarkStart w:id="22" w:name="part-c-manual-finish"/>
+    <w:bookmarkEnd w:id="20"/>
+    <w:bookmarkStart w:id="25" w:name="part-c-manual-finish"/>
     <w:p>
       <w:pPr>
         <w:pStyle w:val="Heading1"/>
@@ -1074,7 +1119,7 @@
         <w:t xml:space="preserve">A couple of steps need your eyes and clicks. Claude can guide you, but you drive.</w:t>
       </w:r>
     </w:p>
-    <w:bookmarkStart w:id="18" w:name="c1.-confirm-sql-server-is-running"/>
+    <w:bookmarkStart w:id="21" w:name="c1.-confirm-sql-server-is-running"/>
     <w:p>
       <w:pPr>
         <w:pStyle w:val="Heading2"/>
@@ -1163,8 +1208,8 @@
         <w:t xml:space="preserve">in an Administrator PowerShell.</w:t>
       </w:r>
     </w:p>
-    <w:bookmarkEnd w:id="18"/>
-    <w:bookmarkStart w:id="19" w:name="c2.-first-connection-in-ssms-smoke-test"/>
+    <w:bookmarkEnd w:id="21"/>
+    <w:bookmarkStart w:id="22" w:name="c2.-first-connection-in-ssms-smoke-test"/>
     <w:p>
       <w:pPr>
         <w:pStyle w:val="Heading2"/>
@@ -1660,8 +1705,8 @@
         <w:t xml:space="preserve">), no errors. Paste any error into Claude Code — it’ll diagnose.</w:t>
       </w:r>
     </w:p>
-    <w:bookmarkEnd w:id="19"/>
-    <w:bookmarkStart w:id="21" w:name="X32a43ed29b8a873f41b8a56a2ced939cba71825"/>
+    <w:bookmarkEnd w:id="22"/>
+    <w:bookmarkStart w:id="24" w:name="X32a43ed29b8a873f41b8a56a2ced939cba71825"/>
     <w:p>
       <w:pPr>
         <w:pStyle w:val="Heading2"/>
@@ -1799,7 +1844,7 @@
       <w:r>
         <w:t xml:space="preserve"> </w:t>
       </w:r>
-      <w:hyperlink r:id="rId20">
+      <w:hyperlink r:id="rId23">
         <w:r>
           <w:rPr>
             <w:rStyle w:val="Hyperlink"/>
@@ -1857,9 +1902,9 @@
         </w:pict>
       </w:r>
     </w:p>
-    <w:bookmarkEnd w:id="21"/>
-    <w:bookmarkEnd w:id="22"/>
-    <w:bookmarkStart w:id="23" w:name="final-verification"/>
+    <w:bookmarkEnd w:id="24"/>
+    <w:bookmarkEnd w:id="25"/>
+    <w:bookmarkStart w:id="26" w:name="final-verification"/>
     <w:p>
       <w:pPr>
         <w:pStyle w:val="Heading1"/>
@@ -2017,8 +2062,8 @@
         </w:pict>
       </w:r>
     </w:p>
-    <w:bookmarkEnd w:id="23"/>
-    <w:bookmarkStart w:id="24" w:name="bring-to-class-checklist"/>
+    <w:bookmarkEnd w:id="26"/>
+    <w:bookmarkStart w:id="27" w:name="bring-to-class-checklist"/>
     <w:p>
       <w:pPr>
         <w:pStyle w:val="Heading1"/>
@@ -2180,8 +2225,8 @@
         </w:pict>
       </w:r>
     </w:p>
-    <w:bookmarkEnd w:id="24"/>
-    <w:bookmarkStart w:id="37" w:name="manual-install-reference-fallback"/>
+    <w:bookmarkEnd w:id="27"/>
+    <w:bookmarkStart w:id="40" w:name="manual-install-reference-fallback"/>
     <w:p>
       <w:pPr>
         <w:pStyle w:val="Heading1"/>
@@ -2198,7 +2243,7 @@
         <w:t xml:space="preserve">If you prefer to install by hand, or if Claude’s assisted install hit a wall, here are the full per-tool steps.</w:t>
       </w:r>
     </w:p>
-    <w:bookmarkStart w:id="26" w:name="visual-studio-2025-community"/>
+    <w:bookmarkStart w:id="29" w:name="visual-studio-2025-community"/>
     <w:p>
       <w:pPr>
         <w:pStyle w:val="Heading2"/>
@@ -2211,7 +2256,7 @@
       <w:pPr>
         <w:pStyle w:val="FirstParagraph"/>
       </w:pPr>
-      <w:hyperlink r:id="rId25">
+      <w:hyperlink r:id="rId28">
         <w:r>
           <w:rPr>
             <w:rStyle w:val="Hyperlink"/>
@@ -2282,8 +2327,8 @@
         <w:t xml:space="preserve">.</w:t>
       </w:r>
     </w:p>
-    <w:bookmarkEnd w:id="26"/>
-    <w:bookmarkStart w:id="28" w:name="net-8-windows-desktop-runtime"/>
+    <w:bookmarkEnd w:id="29"/>
+    <w:bookmarkStart w:id="31" w:name="net-8-windows-desktop-runtime"/>
     <w:p>
       <w:pPr>
         <w:pStyle w:val="Heading2"/>
@@ -2316,7 +2361,7 @@
       <w:pPr>
         <w:pStyle w:val="BodyText"/>
       </w:pPr>
-      <w:hyperlink r:id="rId27">
+      <w:hyperlink r:id="rId30">
         <w:r>
           <w:rPr>
             <w:rStyle w:val="Hyperlink"/>
@@ -2387,8 +2432,8 @@
         <w:t xml:space="preserve">.</w:t>
       </w:r>
     </w:p>
-    <w:bookmarkEnd w:id="28"/>
-    <w:bookmarkStart w:id="30" w:name="sql-server-express"/>
+    <w:bookmarkEnd w:id="31"/>
+    <w:bookmarkStart w:id="33" w:name="sql-server-express"/>
     <w:p>
       <w:pPr>
         <w:pStyle w:val="Heading2"/>
@@ -2407,7 +2452,7 @@
       <w:r>
         <w:t xml:space="preserve"> </w:t>
       </w:r>
-      <w:hyperlink r:id="rId29">
+      <w:hyperlink r:id="rId32">
         <w:r>
           <w:rPr>
             <w:rStyle w:val="Hyperlink"/>
@@ -2476,8 +2521,8 @@
         <w:t xml:space="preserve">). If you already have an instance from a previous course, skip — just confirm it runs (Part C1).</w:t>
       </w:r>
     </w:p>
-    <w:bookmarkEnd w:id="30"/>
-    <w:bookmarkStart w:id="32" w:name="sql-server-management-studio-ssms"/>
+    <w:bookmarkEnd w:id="33"/>
+    <w:bookmarkStart w:id="35" w:name="sql-server-management-studio-ssms"/>
     <w:p>
       <w:pPr>
         <w:pStyle w:val="Heading2"/>
@@ -2490,7 +2535,7 @@
       <w:pPr>
         <w:pStyle w:val="FirstParagraph"/>
       </w:pPr>
-      <w:hyperlink r:id="rId31">
+      <w:hyperlink r:id="rId34">
         <w:r>
           <w:rPr>
             <w:rStyle w:val="Hyperlink"/>
@@ -2502,8 +2547,8 @@
         <w:t xml:space="preserve">. Install with defaults. First connection + smoke test in Part C2.</w:t>
       </w:r>
     </w:p>
-    <w:bookmarkEnd w:id="32"/>
-    <w:bookmarkStart w:id="34" w:name="git"/>
+    <w:bookmarkEnd w:id="35"/>
+    <w:bookmarkStart w:id="37" w:name="git"/>
     <w:p>
       <w:pPr>
         <w:pStyle w:val="Heading2"/>
@@ -2516,7 +2561,7 @@
       <w:pPr>
         <w:pStyle w:val="FirstParagraph"/>
       </w:pPr>
-      <w:hyperlink r:id="rId33">
+      <w:hyperlink r:id="rId36">
         <w:r>
           <w:rPr>
             <w:rStyle w:val="Hyperlink"/>
@@ -2552,8 +2597,8 @@
         <w:t xml:space="preserve">.</w:t>
       </w:r>
     </w:p>
-    <w:bookmarkEnd w:id="34"/>
-    <w:bookmarkStart w:id="35" w:name="uv-python-runner-for-the-mssql-mcp"/>
+    <w:bookmarkEnd w:id="37"/>
+    <w:bookmarkStart w:id="38" w:name="uv-python-runner-for-the-mssql-mcp"/>
     <w:p>
       <w:pPr>
         <w:pStyle w:val="Heading2"/>
@@ -2629,8 +2674,8 @@
         <w:t xml:space="preserve">, reopen the terminal.</w:t>
       </w:r>
     </w:p>
-    <w:bookmarkEnd w:id="35"/>
-    <w:bookmarkStart w:id="36" w:name="vscode-extensions"/>
+    <w:bookmarkEnd w:id="38"/>
+    <w:bookmarkStart w:id="39" w:name="vscode-extensions"/>
     <w:p>
       <w:pPr>
         <w:pStyle w:val="Heading2"/>
@@ -2755,9 +2800,9 @@
         </w:pict>
       </w:r>
     </w:p>
-    <w:bookmarkEnd w:id="36"/>
-    <w:bookmarkEnd w:id="37"/>
-    <w:bookmarkStart w:id="38" w:name="common-problems"/>
+    <w:bookmarkEnd w:id="39"/>
+    <w:bookmarkEnd w:id="40"/>
+    <w:bookmarkStart w:id="41" w:name="common-problems"/>
     <w:p>
       <w:pPr>
         <w:pStyle w:val="Heading1"/>
@@ -3307,7 +3352,7 @@
         <w:t xml:space="preserve">paste the symptom into Claude Code. It has the context to diagnose and usually fixes it faster than the table.</w:t>
       </w:r>
     </w:p>
-    <w:bookmarkEnd w:id="38"/>
+    <w:bookmarkEnd w:id="41"/>
     <w:sectPr>
       <w:footnotePr>
         <w:numRestart w:val="eachSect"/>
@@ -4019,6 +4064,7 @@
     <w:qFormat/>
     <w:rsid w:val="00A10FD9"/>
     <w:pPr>
+      <w:pageBreakBefore/>
       <w:keepNext/>
       <w:keepLines/>
       <w:spacing w:after="80" w:before="360"/>
@@ -4487,6 +4533,13 @@
       <w:bCs w:val="0"/>
       <w:color w:themeColor="accent1" w:themeShade="BF" w:val="365F91"/>
     </w:rPr>
+  </w:style>
+  <w:style w:styleId="Centered" w:type="paragraph">
+    <w:name w:val="Centered"/>
+    <w:basedOn w:val="Normal"/>
+    <w:pPr>
+      <w:jc w:val="center"/>
+    </w:pPr>
   </w:style>
   <w:style w:type="paragraph" w:customStyle="1" w:styleId="SourceCode">
     <w:name w:val="Source Code"/>

</xml_diff>

<commit_message>
Restore TOC in PREREQS + cheat sheet; make title page a full page
The TOC was lost when --toc got dropped to control title-page placement.
Brought it back and fixed the ordering:

- Generate with --toc (pandoc puts the TOC at the very top of the body).
- fix_toc.py relocates the TOC block to just after the title-page lines
  and inserts a page break before it. Result order: title page (logo,
  course, subtitle, lecturer) -> page break -> TOC -> chapters.
- Title page is now a full page (page break after the author line),
  not just a title at the top of page 1.
- Each main part still starts on a new page (Heading1 pageBreakBefore
  in reference.docx).

Added build-docs.sh: one command regenerates all four distributables
(PREREQS.docx, PROMPTS_CHEATSHEET.docx, SLIDE_DECK.pptx, SLIDE_DECK.docx)
from the markdown sources. Open the .docx files in Word once after
building so the TOC field populates, then save.

Co-Authored-By: Claude Opus 4.7 (1M context) <noreply@anthropic.com>
</commit_message>
<xml_diff>
--- a/PREREQS.docx
+++ b/PREREQS.docx
@@ -73,6 +73,37 @@
         <w:t xml:space="preserve">Lecturer: David Codish</w:t>
       </w:r>
     </w:p>
+    <w:p>
+      <w:r>
+        <w:br w:type="page"/>
+      </w:r>
+    </w:p>
+    <w:sdt>
+      <w:sdtPr>
+        <w:docPartObj>
+          <w:docPartGallery w:val="Table of Contents"/>
+          <w:docPartUnique/>
+        </w:docPartObj>
+      </w:sdtPr>
+      <w:sdtContent>
+        <w:p>
+          <w:pPr>
+            <w:pStyle w:val="TOCHeading"/>
+          </w:pPr>
+          <w:r>
+            <w:t xml:space="preserve">Table of Contents</w:t>
+          </w:r>
+        </w:p>
+        <w:p>
+          <w:r>
+            <w:fldChar w:fldCharType="begin" w:dirty="true"/>
+            <w:instrText xml:space="preserve">TOC \o "1-3" \h \z \u</w:instrText>
+            <w:fldChar w:fldCharType="separate"/>
+            <w:fldChar w:fldCharType="end"/>
+          </w:r>
+        </w:p>
+      </w:sdtContent>
+    </w:sdt>
     <w:bookmarkStart w:id="13" w:name="prerequisites-sad-course-pre-class-setup"/>
     <w:p>
       <w:pPr>

</xml_diff>